<commit_message>
finalized the model and notebook file.
</commit_message>
<xml_diff>
--- a/madrigal_concept_reflection.docx
+++ b/madrigal_concept_reflection.docx
@@ -108,27 +108,46 @@
         <w:t xml:space="preserve">3. If the cost of funding a bad loan is roughly 10 times the cost of turning away a good borrower, how should the classification threshold shift, and why? </w:t>
       </w:r>
     </w:p>
-    <w:p/>
-    <w:p/>
     <w:p>
       <w:r>
-        <w:t xml:space="preserve">4. Why did your pipeline scale the features after the train/test split, not before? What specifically would have gone wrong if you scaled first? </w:t>
-      </w:r>
-    </w:p>
-    <w:p>
-      <w:r>
-        <w:t xml:space="preserve">The 80/20 split is random. We can’t know what values will end up in </w:t>
-      </w:r>
-      <w:r>
-        <w:t xml:space="preserve">either set. If the features were scaled before, they would be scaled to the entire dataset, not the subset, thereby improperly scaling </w:t>
-      </w:r>
-      <w:r>
-        <w:t>to the missing values.</w:t>
+        <w:t xml:space="preserve">Yes, that </w:t>
+      </w:r>
+      <w:r>
+        <w:t>would</w:t>
+      </w:r>
+      <w:r>
+        <w:t xml:space="preserve"> influence where you set the classification threshold</w:t>
+      </w:r>
+      <w:r>
+        <w:t>, especially in a</w:t>
+      </w:r>
+      <w:r>
+        <w:t>n unbalanced dataset like this one</w:t>
+      </w:r>
+      <w:r>
+        <w:t xml:space="preserve">. For example, </w:t>
       </w:r>
     </w:p>
     <w:p/>
     <w:p>
       <w:r>
+        <w:t xml:space="preserve">4. Why did your pipeline scale the features after the train/test split, not before? What specifically would have gone wrong if you scaled first? </w:t>
+      </w:r>
+    </w:p>
+    <w:p>
+      <w:r>
+        <w:t xml:space="preserve">The 80/20 split is random. We can’t know what values will end up in </w:t>
+      </w:r>
+      <w:r>
+        <w:t xml:space="preserve">either set. If the features were scaled before, they would be scaled to the entire dataset, not the subset, thereby improperly scaling </w:t>
+      </w:r>
+      <w:r>
+        <w:t>to the missing values.</w:t>
+      </w:r>
+    </w:p>
+    <w:p/>
+    <w:p>
+      <w:r>
         <w:t xml:space="preserve">5. If you had ordinal-encoded the Lending Club loan grade (A–G) as 1–7 instead of </w:t>
       </w:r>
       <w:proofErr w:type="spellStart"/>
@@ -140,6 +159,1209 @@
         <w:t>, what specific modeling problem could that create for logistic regression — and does it matter for decision trees?</w:t>
       </w:r>
     </w:p>
+    <w:p/>
+    <w:p/>
+    <w:tbl>
+      <w:tblPr>
+        <w:tblW w:w="6518" w:type="dxa"/>
+        <w:tblLook w:val="04A0" w:firstRow="1" w:lastRow="0" w:firstColumn="1" w:lastColumn="0" w:noHBand="0" w:noVBand="1"/>
+      </w:tblPr>
+      <w:tblGrid>
+        <w:gridCol w:w="1718"/>
+        <w:gridCol w:w="1029"/>
+        <w:gridCol w:w="1032"/>
+        <w:gridCol w:w="960"/>
+        <w:gridCol w:w="960"/>
+        <w:gridCol w:w="960"/>
+      </w:tblGrid>
+      <w:tr>
+        <w:trPr>
+          <w:trHeight w:val="290"/>
+        </w:trPr>
+        <w:tc>
+          <w:tcPr>
+            <w:tcW w:w="1718" w:type="dxa"/>
+            <w:tcBorders>
+              <w:top w:val="nil"/>
+              <w:left w:val="nil"/>
+              <w:bottom w:val="nil"/>
+              <w:right w:val="nil"/>
+            </w:tcBorders>
+            <w:noWrap/>
+            <w:vAlign w:val="center"/>
+            <w:hideMark/>
+          </w:tcPr>
+          <w:p>
+            <w:pPr>
+              <w:spacing w:after="0" w:line="240" w:lineRule="auto"/>
+              <w:rPr>
+                <w:rFonts w:ascii="Consolas" w:eastAsia="Times New Roman" w:hAnsi="Consolas" w:cs="Times New Roman"/>
+                <w:color w:val="202020"/>
+                <w:kern w:val="0"/>
+                <w:sz w:val="14"/>
+                <w:szCs w:val="14"/>
+                <w14:ligatures w14:val="none"/>
+              </w:rPr>
+            </w:pPr>
+            <w:r>
+              <w:rPr>
+                <w:rFonts w:ascii="Consolas" w:eastAsia="Times New Roman" w:hAnsi="Consolas" w:cs="Times New Roman"/>
+                <w:color w:val="202020"/>
+                <w:kern w:val="0"/>
+                <w:sz w:val="14"/>
+                <w:szCs w:val="14"/>
+                <w14:ligatures w14:val="none"/>
+              </w:rPr>
+              <w:t>Model</w:t>
+            </w:r>
+          </w:p>
+        </w:tc>
+        <w:tc>
+          <w:tcPr>
+            <w:tcW w:w="960" w:type="dxa"/>
+            <w:tcBorders>
+              <w:top w:val="nil"/>
+              <w:left w:val="nil"/>
+              <w:bottom w:val="nil"/>
+              <w:right w:val="nil"/>
+            </w:tcBorders>
+            <w:noWrap/>
+            <w:vAlign w:val="bottom"/>
+            <w:hideMark/>
+          </w:tcPr>
+          <w:p>
+            <w:pPr>
+              <w:spacing w:after="0" w:line="240" w:lineRule="auto"/>
+              <w:rPr>
+                <w:rFonts w:ascii="Aptos Narrow" w:eastAsia="Times New Roman" w:hAnsi="Aptos Narrow" w:cs="Times New Roman"/>
+                <w:color w:val="000000"/>
+                <w:kern w:val="0"/>
+                <w:sz w:val="22"/>
+                <w:szCs w:val="22"/>
+                <w14:ligatures w14:val="none"/>
+              </w:rPr>
+            </w:pPr>
+            <w:r>
+              <w:rPr>
+                <w:rFonts w:ascii="Aptos Narrow" w:eastAsia="Times New Roman" w:hAnsi="Aptos Narrow" w:cs="Times New Roman"/>
+                <w:color w:val="000000"/>
+                <w:kern w:val="0"/>
+                <w:sz w:val="22"/>
+                <w:szCs w:val="22"/>
+                <w14:ligatures w14:val="none"/>
+              </w:rPr>
+              <w:t>Accuracy</w:t>
+            </w:r>
+          </w:p>
+        </w:tc>
+        <w:tc>
+          <w:tcPr>
+            <w:tcW w:w="960" w:type="dxa"/>
+            <w:tcBorders>
+              <w:top w:val="nil"/>
+              <w:left w:val="nil"/>
+              <w:bottom w:val="nil"/>
+              <w:right w:val="nil"/>
+            </w:tcBorders>
+            <w:noWrap/>
+            <w:vAlign w:val="bottom"/>
+            <w:hideMark/>
+          </w:tcPr>
+          <w:p>
+            <w:pPr>
+              <w:spacing w:after="0" w:line="240" w:lineRule="auto"/>
+              <w:rPr>
+                <w:rFonts w:ascii="Aptos Narrow" w:eastAsia="Times New Roman" w:hAnsi="Aptos Narrow" w:cs="Times New Roman"/>
+                <w:color w:val="000000"/>
+                <w:kern w:val="0"/>
+                <w:sz w:val="22"/>
+                <w:szCs w:val="22"/>
+                <w14:ligatures w14:val="none"/>
+              </w:rPr>
+            </w:pPr>
+            <w:r>
+              <w:rPr>
+                <w:rFonts w:ascii="Aptos Narrow" w:eastAsia="Times New Roman" w:hAnsi="Aptos Narrow" w:cs="Times New Roman"/>
+                <w:color w:val="000000"/>
+                <w:kern w:val="0"/>
+                <w:sz w:val="22"/>
+                <w:szCs w:val="22"/>
+                <w14:ligatures w14:val="none"/>
+              </w:rPr>
+              <w:t>Precision</w:t>
+            </w:r>
+          </w:p>
+        </w:tc>
+        <w:tc>
+          <w:tcPr>
+            <w:tcW w:w="960" w:type="dxa"/>
+            <w:tcBorders>
+              <w:top w:val="nil"/>
+              <w:left w:val="nil"/>
+              <w:bottom w:val="nil"/>
+              <w:right w:val="nil"/>
+            </w:tcBorders>
+            <w:noWrap/>
+            <w:vAlign w:val="bottom"/>
+            <w:hideMark/>
+          </w:tcPr>
+          <w:p>
+            <w:pPr>
+              <w:spacing w:after="0" w:line="240" w:lineRule="auto"/>
+              <w:rPr>
+                <w:rFonts w:ascii="Aptos Narrow" w:eastAsia="Times New Roman" w:hAnsi="Aptos Narrow" w:cs="Times New Roman"/>
+                <w:color w:val="000000"/>
+                <w:kern w:val="0"/>
+                <w:sz w:val="22"/>
+                <w:szCs w:val="22"/>
+                <w14:ligatures w14:val="none"/>
+              </w:rPr>
+            </w:pPr>
+            <w:r>
+              <w:rPr>
+                <w:rFonts w:ascii="Aptos Narrow" w:eastAsia="Times New Roman" w:hAnsi="Aptos Narrow" w:cs="Times New Roman"/>
+                <w:color w:val="000000"/>
+                <w:kern w:val="0"/>
+                <w:sz w:val="22"/>
+                <w:szCs w:val="22"/>
+                <w14:ligatures w14:val="none"/>
+              </w:rPr>
+              <w:t>Recall</w:t>
+            </w:r>
+          </w:p>
+        </w:tc>
+        <w:tc>
+          <w:tcPr>
+            <w:tcW w:w="960" w:type="dxa"/>
+            <w:tcBorders>
+              <w:top w:val="nil"/>
+              <w:left w:val="nil"/>
+              <w:bottom w:val="nil"/>
+              <w:right w:val="nil"/>
+            </w:tcBorders>
+            <w:noWrap/>
+            <w:vAlign w:val="bottom"/>
+            <w:hideMark/>
+          </w:tcPr>
+          <w:p>
+            <w:pPr>
+              <w:spacing w:after="0" w:line="240" w:lineRule="auto"/>
+              <w:rPr>
+                <w:rFonts w:ascii="Aptos Narrow" w:eastAsia="Times New Roman" w:hAnsi="Aptos Narrow" w:cs="Times New Roman"/>
+                <w:color w:val="000000"/>
+                <w:kern w:val="0"/>
+                <w:sz w:val="22"/>
+                <w:szCs w:val="22"/>
+                <w14:ligatures w14:val="none"/>
+              </w:rPr>
+            </w:pPr>
+            <w:r>
+              <w:rPr>
+                <w:rFonts w:ascii="Aptos Narrow" w:eastAsia="Times New Roman" w:hAnsi="Aptos Narrow" w:cs="Times New Roman"/>
+                <w:color w:val="000000"/>
+                <w:kern w:val="0"/>
+                <w:sz w:val="22"/>
+                <w:szCs w:val="22"/>
+                <w14:ligatures w14:val="none"/>
+              </w:rPr>
+              <w:t>F1</w:t>
+            </w:r>
+          </w:p>
+        </w:tc>
+        <w:tc>
+          <w:tcPr>
+            <w:tcW w:w="960" w:type="dxa"/>
+            <w:tcBorders>
+              <w:top w:val="nil"/>
+              <w:left w:val="nil"/>
+              <w:bottom w:val="nil"/>
+              <w:right w:val="nil"/>
+            </w:tcBorders>
+            <w:noWrap/>
+            <w:vAlign w:val="bottom"/>
+            <w:hideMark/>
+          </w:tcPr>
+          <w:p>
+            <w:pPr>
+              <w:spacing w:after="0" w:line="240" w:lineRule="auto"/>
+              <w:rPr>
+                <w:rFonts w:ascii="Aptos Narrow" w:eastAsia="Times New Roman" w:hAnsi="Aptos Narrow" w:cs="Times New Roman"/>
+                <w:color w:val="000000"/>
+                <w:kern w:val="0"/>
+                <w:sz w:val="22"/>
+                <w:szCs w:val="22"/>
+                <w14:ligatures w14:val="none"/>
+              </w:rPr>
+            </w:pPr>
+            <w:r>
+              <w:rPr>
+                <w:rFonts w:ascii="Aptos Narrow" w:eastAsia="Times New Roman" w:hAnsi="Aptos Narrow" w:cs="Times New Roman"/>
+                <w:color w:val="000000"/>
+                <w:kern w:val="0"/>
+                <w:sz w:val="22"/>
+                <w:szCs w:val="22"/>
+                <w14:ligatures w14:val="none"/>
+              </w:rPr>
+              <w:t>ROC-AUC</w:t>
+            </w:r>
+          </w:p>
+        </w:tc>
+      </w:tr>
+      <w:tr>
+        <w:trPr>
+          <w:trHeight w:val="290"/>
+        </w:trPr>
+        <w:tc>
+          <w:tcPr>
+            <w:tcW w:w="1718" w:type="dxa"/>
+            <w:tcBorders>
+              <w:top w:val="nil"/>
+              <w:left w:val="nil"/>
+              <w:bottom w:val="nil"/>
+              <w:right w:val="nil"/>
+            </w:tcBorders>
+            <w:noWrap/>
+            <w:vAlign w:val="bottom"/>
+            <w:hideMark/>
+          </w:tcPr>
+          <w:p>
+            <w:pPr>
+              <w:spacing w:after="0" w:line="240" w:lineRule="auto"/>
+              <w:rPr>
+                <w:rFonts w:ascii="Aptos Narrow" w:eastAsia="Times New Roman" w:hAnsi="Aptos Narrow" w:cs="Times New Roman"/>
+                <w:color w:val="000000"/>
+                <w:kern w:val="0"/>
+                <w:sz w:val="22"/>
+                <w:szCs w:val="22"/>
+                <w14:ligatures w14:val="none"/>
+              </w:rPr>
+            </w:pPr>
+            <w:r>
+              <w:rPr>
+                <w:rFonts w:ascii="Aptos Narrow" w:eastAsia="Times New Roman" w:hAnsi="Aptos Narrow" w:cs="Times New Roman"/>
+                <w:color w:val="000000"/>
+                <w:kern w:val="0"/>
+                <w:sz w:val="22"/>
+                <w:szCs w:val="22"/>
+                <w14:ligatures w14:val="none"/>
+              </w:rPr>
+              <w:t>Logistic Regression</w:t>
+            </w:r>
+          </w:p>
+        </w:tc>
+        <w:tc>
+          <w:tcPr>
+            <w:tcW w:w="960" w:type="dxa"/>
+            <w:tcBorders>
+              <w:top w:val="nil"/>
+              <w:left w:val="nil"/>
+              <w:bottom w:val="nil"/>
+              <w:right w:val="nil"/>
+            </w:tcBorders>
+            <w:noWrap/>
+            <w:vAlign w:val="bottom"/>
+            <w:hideMark/>
+          </w:tcPr>
+          <w:p>
+            <w:pPr>
+              <w:spacing w:after="0" w:line="240" w:lineRule="auto"/>
+              <w:jc w:val="right"/>
+              <w:rPr>
+                <w:rFonts w:ascii="Aptos Narrow" w:eastAsia="Times New Roman" w:hAnsi="Aptos Narrow" w:cs="Times New Roman"/>
+                <w:color w:val="000000"/>
+                <w:kern w:val="0"/>
+                <w:sz w:val="22"/>
+                <w:szCs w:val="22"/>
+                <w14:ligatures w14:val="none"/>
+              </w:rPr>
+            </w:pPr>
+            <w:r>
+              <w:rPr>
+                <w:rFonts w:ascii="Aptos Narrow" w:eastAsia="Times New Roman" w:hAnsi="Aptos Narrow" w:cs="Times New Roman"/>
+                <w:color w:val="000000"/>
+                <w:kern w:val="0"/>
+                <w:sz w:val="22"/>
+                <w:szCs w:val="22"/>
+                <w14:ligatures w14:val="none"/>
+              </w:rPr>
+              <w:t>0.6895</w:t>
+            </w:r>
+          </w:p>
+        </w:tc>
+        <w:tc>
+          <w:tcPr>
+            <w:tcW w:w="960" w:type="dxa"/>
+            <w:tcBorders>
+              <w:top w:val="nil"/>
+              <w:left w:val="nil"/>
+              <w:bottom w:val="nil"/>
+              <w:right w:val="nil"/>
+            </w:tcBorders>
+            <w:noWrap/>
+            <w:vAlign w:val="bottom"/>
+            <w:hideMark/>
+          </w:tcPr>
+          <w:p>
+            <w:pPr>
+              <w:spacing w:after="0" w:line="240" w:lineRule="auto"/>
+              <w:jc w:val="right"/>
+              <w:rPr>
+                <w:rFonts w:ascii="Aptos Narrow" w:eastAsia="Times New Roman" w:hAnsi="Aptos Narrow" w:cs="Times New Roman"/>
+                <w:color w:val="000000"/>
+                <w:kern w:val="0"/>
+                <w:sz w:val="22"/>
+                <w:szCs w:val="22"/>
+                <w14:ligatures w14:val="none"/>
+              </w:rPr>
+            </w:pPr>
+            <w:r>
+              <w:rPr>
+                <w:rFonts w:ascii="Aptos Narrow" w:eastAsia="Times New Roman" w:hAnsi="Aptos Narrow" w:cs="Times New Roman"/>
+                <w:color w:val="000000"/>
+                <w:kern w:val="0"/>
+                <w:sz w:val="22"/>
+                <w:szCs w:val="22"/>
+                <w14:ligatures w14:val="none"/>
+              </w:rPr>
+              <w:t>0.3355</w:t>
+            </w:r>
+          </w:p>
+        </w:tc>
+        <w:tc>
+          <w:tcPr>
+            <w:tcW w:w="960" w:type="dxa"/>
+            <w:tcBorders>
+              <w:top w:val="nil"/>
+              <w:left w:val="nil"/>
+              <w:bottom w:val="nil"/>
+              <w:right w:val="nil"/>
+            </w:tcBorders>
+            <w:noWrap/>
+            <w:vAlign w:val="bottom"/>
+            <w:hideMark/>
+          </w:tcPr>
+          <w:p>
+            <w:pPr>
+              <w:spacing w:after="0" w:line="240" w:lineRule="auto"/>
+              <w:jc w:val="right"/>
+              <w:rPr>
+                <w:rFonts w:ascii="Aptos Narrow" w:eastAsia="Times New Roman" w:hAnsi="Aptos Narrow" w:cs="Times New Roman"/>
+                <w:color w:val="000000"/>
+                <w:kern w:val="0"/>
+                <w:sz w:val="22"/>
+                <w:szCs w:val="22"/>
+                <w14:ligatures w14:val="none"/>
+              </w:rPr>
+            </w:pPr>
+            <w:r>
+              <w:rPr>
+                <w:rFonts w:ascii="Aptos Narrow" w:eastAsia="Times New Roman" w:hAnsi="Aptos Narrow" w:cs="Times New Roman"/>
+                <w:color w:val="000000"/>
+                <w:kern w:val="0"/>
+                <w:sz w:val="22"/>
+                <w:szCs w:val="22"/>
+                <w14:ligatures w14:val="none"/>
+              </w:rPr>
+              <w:t>0.6919</w:t>
+            </w:r>
+          </w:p>
+        </w:tc>
+        <w:tc>
+          <w:tcPr>
+            <w:tcW w:w="960" w:type="dxa"/>
+            <w:tcBorders>
+              <w:top w:val="nil"/>
+              <w:left w:val="nil"/>
+              <w:bottom w:val="nil"/>
+              <w:right w:val="nil"/>
+            </w:tcBorders>
+            <w:noWrap/>
+            <w:vAlign w:val="bottom"/>
+            <w:hideMark/>
+          </w:tcPr>
+          <w:p>
+            <w:pPr>
+              <w:spacing w:after="0" w:line="240" w:lineRule="auto"/>
+              <w:jc w:val="right"/>
+              <w:rPr>
+                <w:rFonts w:ascii="Aptos Narrow" w:eastAsia="Times New Roman" w:hAnsi="Aptos Narrow" w:cs="Times New Roman"/>
+                <w:color w:val="000000"/>
+                <w:kern w:val="0"/>
+                <w:sz w:val="22"/>
+                <w:szCs w:val="22"/>
+                <w14:ligatures w14:val="none"/>
+              </w:rPr>
+            </w:pPr>
+            <w:r>
+              <w:rPr>
+                <w:rFonts w:ascii="Aptos Narrow" w:eastAsia="Times New Roman" w:hAnsi="Aptos Narrow" w:cs="Times New Roman"/>
+                <w:color w:val="000000"/>
+                <w:kern w:val="0"/>
+                <w:sz w:val="22"/>
+                <w:szCs w:val="22"/>
+                <w14:ligatures w14:val="none"/>
+              </w:rPr>
+              <w:t>0.4519</w:t>
+            </w:r>
+          </w:p>
+        </w:tc>
+        <w:tc>
+          <w:tcPr>
+            <w:tcW w:w="960" w:type="dxa"/>
+            <w:tcBorders>
+              <w:top w:val="nil"/>
+              <w:left w:val="nil"/>
+              <w:bottom w:val="nil"/>
+              <w:right w:val="nil"/>
+            </w:tcBorders>
+            <w:noWrap/>
+            <w:vAlign w:val="bottom"/>
+            <w:hideMark/>
+          </w:tcPr>
+          <w:p>
+            <w:pPr>
+              <w:spacing w:after="0" w:line="240" w:lineRule="auto"/>
+              <w:jc w:val="right"/>
+              <w:rPr>
+                <w:rFonts w:ascii="Aptos Narrow" w:eastAsia="Times New Roman" w:hAnsi="Aptos Narrow" w:cs="Times New Roman"/>
+                <w:color w:val="000000"/>
+                <w:kern w:val="0"/>
+                <w:sz w:val="22"/>
+                <w:szCs w:val="22"/>
+                <w14:ligatures w14:val="none"/>
+              </w:rPr>
+            </w:pPr>
+            <w:r>
+              <w:rPr>
+                <w:rFonts w:ascii="Aptos Narrow" w:eastAsia="Times New Roman" w:hAnsi="Aptos Narrow" w:cs="Times New Roman"/>
+                <w:color w:val="000000"/>
+                <w:kern w:val="0"/>
+                <w:sz w:val="22"/>
+                <w:szCs w:val="22"/>
+                <w14:ligatures w14:val="none"/>
+              </w:rPr>
+              <w:t>0.7454</w:t>
+            </w:r>
+          </w:p>
+        </w:tc>
+      </w:tr>
+      <w:tr>
+        <w:trPr>
+          <w:trHeight w:val="290"/>
+        </w:trPr>
+        <w:tc>
+          <w:tcPr>
+            <w:tcW w:w="1718" w:type="dxa"/>
+            <w:tcBorders>
+              <w:top w:val="nil"/>
+              <w:left w:val="nil"/>
+              <w:bottom w:val="nil"/>
+              <w:right w:val="nil"/>
+            </w:tcBorders>
+            <w:noWrap/>
+            <w:vAlign w:val="bottom"/>
+            <w:hideMark/>
+          </w:tcPr>
+          <w:p>
+            <w:pPr>
+              <w:spacing w:after="0" w:line="240" w:lineRule="auto"/>
+              <w:rPr>
+                <w:rFonts w:ascii="Aptos Narrow" w:eastAsia="Times New Roman" w:hAnsi="Aptos Narrow" w:cs="Times New Roman"/>
+                <w:color w:val="000000"/>
+                <w:kern w:val="0"/>
+                <w:sz w:val="22"/>
+                <w:szCs w:val="22"/>
+                <w14:ligatures w14:val="none"/>
+              </w:rPr>
+            </w:pPr>
+            <w:r>
+              <w:rPr>
+                <w:rFonts w:ascii="Aptos Narrow" w:eastAsia="Times New Roman" w:hAnsi="Aptos Narrow" w:cs="Times New Roman"/>
+                <w:color w:val="000000"/>
+                <w:kern w:val="0"/>
+                <w:sz w:val="22"/>
+                <w:szCs w:val="22"/>
+                <w14:ligatures w14:val="none"/>
+              </w:rPr>
+              <w:lastRenderedPageBreak/>
+              <w:t>Decision Tree</w:t>
+            </w:r>
+          </w:p>
+        </w:tc>
+        <w:tc>
+          <w:tcPr>
+            <w:tcW w:w="960" w:type="dxa"/>
+            <w:tcBorders>
+              <w:top w:val="nil"/>
+              <w:left w:val="nil"/>
+              <w:bottom w:val="nil"/>
+              <w:right w:val="nil"/>
+            </w:tcBorders>
+            <w:noWrap/>
+            <w:vAlign w:val="bottom"/>
+            <w:hideMark/>
+          </w:tcPr>
+          <w:p>
+            <w:pPr>
+              <w:spacing w:after="0" w:line="240" w:lineRule="auto"/>
+              <w:jc w:val="right"/>
+              <w:rPr>
+                <w:rFonts w:ascii="Aptos Narrow" w:eastAsia="Times New Roman" w:hAnsi="Aptos Narrow" w:cs="Times New Roman"/>
+                <w:color w:val="000000"/>
+                <w:kern w:val="0"/>
+                <w:sz w:val="22"/>
+                <w:szCs w:val="22"/>
+                <w14:ligatures w14:val="none"/>
+              </w:rPr>
+            </w:pPr>
+            <w:r>
+              <w:rPr>
+                <w:rFonts w:ascii="Aptos Narrow" w:eastAsia="Times New Roman" w:hAnsi="Aptos Narrow" w:cs="Times New Roman"/>
+                <w:color w:val="000000"/>
+                <w:kern w:val="0"/>
+                <w:sz w:val="22"/>
+                <w:szCs w:val="22"/>
+                <w14:ligatures w14:val="none"/>
+              </w:rPr>
+              <w:t>0.6515</w:t>
+            </w:r>
+          </w:p>
+        </w:tc>
+        <w:tc>
+          <w:tcPr>
+            <w:tcW w:w="960" w:type="dxa"/>
+            <w:tcBorders>
+              <w:top w:val="nil"/>
+              <w:left w:val="nil"/>
+              <w:bottom w:val="nil"/>
+              <w:right w:val="nil"/>
+            </w:tcBorders>
+            <w:noWrap/>
+            <w:vAlign w:val="bottom"/>
+            <w:hideMark/>
+          </w:tcPr>
+          <w:p>
+            <w:pPr>
+              <w:spacing w:after="0" w:line="240" w:lineRule="auto"/>
+              <w:jc w:val="right"/>
+              <w:rPr>
+                <w:rFonts w:ascii="Aptos Narrow" w:eastAsia="Times New Roman" w:hAnsi="Aptos Narrow" w:cs="Times New Roman"/>
+                <w:color w:val="000000"/>
+                <w:kern w:val="0"/>
+                <w:sz w:val="22"/>
+                <w:szCs w:val="22"/>
+                <w14:ligatures w14:val="none"/>
+              </w:rPr>
+            </w:pPr>
+            <w:r>
+              <w:rPr>
+                <w:rFonts w:ascii="Aptos Narrow" w:eastAsia="Times New Roman" w:hAnsi="Aptos Narrow" w:cs="Times New Roman"/>
+                <w:color w:val="000000"/>
+                <w:kern w:val="0"/>
+                <w:sz w:val="22"/>
+                <w:szCs w:val="22"/>
+                <w14:ligatures w14:val="none"/>
+              </w:rPr>
+              <w:t>0.2974</w:t>
+            </w:r>
+          </w:p>
+        </w:tc>
+        <w:tc>
+          <w:tcPr>
+            <w:tcW w:w="960" w:type="dxa"/>
+            <w:tcBorders>
+              <w:top w:val="nil"/>
+              <w:left w:val="nil"/>
+              <w:bottom w:val="nil"/>
+              <w:right w:val="nil"/>
+            </w:tcBorders>
+            <w:noWrap/>
+            <w:vAlign w:val="bottom"/>
+            <w:hideMark/>
+          </w:tcPr>
+          <w:p>
+            <w:pPr>
+              <w:spacing w:after="0" w:line="240" w:lineRule="auto"/>
+              <w:jc w:val="right"/>
+              <w:rPr>
+                <w:rFonts w:ascii="Aptos Narrow" w:eastAsia="Times New Roman" w:hAnsi="Aptos Narrow" w:cs="Times New Roman"/>
+                <w:color w:val="000000"/>
+                <w:kern w:val="0"/>
+                <w:sz w:val="22"/>
+                <w:szCs w:val="22"/>
+                <w14:ligatures w14:val="none"/>
+              </w:rPr>
+            </w:pPr>
+            <w:r>
+              <w:rPr>
+                <w:rFonts w:ascii="Aptos Narrow" w:eastAsia="Times New Roman" w:hAnsi="Aptos Narrow" w:cs="Times New Roman"/>
+                <w:color w:val="000000"/>
+                <w:kern w:val="0"/>
+                <w:sz w:val="22"/>
+                <w:szCs w:val="22"/>
+                <w14:ligatures w14:val="none"/>
+              </w:rPr>
+              <w:t>0.6486</w:t>
+            </w:r>
+          </w:p>
+        </w:tc>
+        <w:tc>
+          <w:tcPr>
+            <w:tcW w:w="960" w:type="dxa"/>
+            <w:tcBorders>
+              <w:top w:val="nil"/>
+              <w:left w:val="nil"/>
+              <w:bottom w:val="nil"/>
+              <w:right w:val="nil"/>
+            </w:tcBorders>
+            <w:noWrap/>
+            <w:vAlign w:val="bottom"/>
+            <w:hideMark/>
+          </w:tcPr>
+          <w:p>
+            <w:pPr>
+              <w:spacing w:after="0" w:line="240" w:lineRule="auto"/>
+              <w:jc w:val="right"/>
+              <w:rPr>
+                <w:rFonts w:ascii="Aptos Narrow" w:eastAsia="Times New Roman" w:hAnsi="Aptos Narrow" w:cs="Times New Roman"/>
+                <w:color w:val="000000"/>
+                <w:kern w:val="0"/>
+                <w:sz w:val="22"/>
+                <w:szCs w:val="22"/>
+                <w14:ligatures w14:val="none"/>
+              </w:rPr>
+            </w:pPr>
+            <w:r>
+              <w:rPr>
+                <w:rFonts w:ascii="Aptos Narrow" w:eastAsia="Times New Roman" w:hAnsi="Aptos Narrow" w:cs="Times New Roman"/>
+                <w:color w:val="000000"/>
+                <w:kern w:val="0"/>
+                <w:sz w:val="22"/>
+                <w:szCs w:val="22"/>
+                <w14:ligatures w14:val="none"/>
+              </w:rPr>
+              <w:t>0.4078</w:t>
+            </w:r>
+          </w:p>
+        </w:tc>
+        <w:tc>
+          <w:tcPr>
+            <w:tcW w:w="960" w:type="dxa"/>
+            <w:tcBorders>
+              <w:top w:val="nil"/>
+              <w:left w:val="nil"/>
+              <w:bottom w:val="nil"/>
+              <w:right w:val="nil"/>
+            </w:tcBorders>
+            <w:noWrap/>
+            <w:vAlign w:val="bottom"/>
+            <w:hideMark/>
+          </w:tcPr>
+          <w:p>
+            <w:pPr>
+              <w:spacing w:after="0" w:line="240" w:lineRule="auto"/>
+              <w:jc w:val="right"/>
+              <w:rPr>
+                <w:rFonts w:ascii="Aptos Narrow" w:eastAsia="Times New Roman" w:hAnsi="Aptos Narrow" w:cs="Times New Roman"/>
+                <w:color w:val="000000"/>
+                <w:kern w:val="0"/>
+                <w:sz w:val="22"/>
+                <w:szCs w:val="22"/>
+                <w14:ligatures w14:val="none"/>
+              </w:rPr>
+            </w:pPr>
+            <w:r>
+              <w:rPr>
+                <w:rFonts w:ascii="Aptos Narrow" w:eastAsia="Times New Roman" w:hAnsi="Aptos Narrow" w:cs="Times New Roman"/>
+                <w:color w:val="000000"/>
+                <w:kern w:val="0"/>
+                <w:sz w:val="22"/>
+                <w:szCs w:val="22"/>
+                <w14:ligatures w14:val="none"/>
+              </w:rPr>
+              <w:t>0.6976</w:t>
+            </w:r>
+          </w:p>
+        </w:tc>
+      </w:tr>
+      <w:tr>
+        <w:trPr>
+          <w:trHeight w:val="290"/>
+        </w:trPr>
+        <w:tc>
+          <w:tcPr>
+            <w:tcW w:w="1718" w:type="dxa"/>
+            <w:tcBorders>
+              <w:top w:val="nil"/>
+              <w:left w:val="nil"/>
+              <w:bottom w:val="nil"/>
+              <w:right w:val="nil"/>
+            </w:tcBorders>
+            <w:noWrap/>
+            <w:vAlign w:val="bottom"/>
+            <w:hideMark/>
+          </w:tcPr>
+          <w:p>
+            <w:pPr>
+              <w:spacing w:after="0" w:line="240" w:lineRule="auto"/>
+              <w:rPr>
+                <w:rFonts w:ascii="Aptos Narrow" w:eastAsia="Times New Roman" w:hAnsi="Aptos Narrow" w:cs="Times New Roman"/>
+                <w:color w:val="000000"/>
+                <w:kern w:val="0"/>
+                <w:sz w:val="22"/>
+                <w:szCs w:val="22"/>
+                <w14:ligatures w14:val="none"/>
+              </w:rPr>
+            </w:pPr>
+            <w:r>
+              <w:rPr>
+                <w:rFonts w:ascii="Aptos Narrow" w:eastAsia="Times New Roman" w:hAnsi="Aptos Narrow" w:cs="Times New Roman"/>
+                <w:color w:val="000000"/>
+                <w:kern w:val="0"/>
+                <w:sz w:val="22"/>
+                <w:szCs w:val="22"/>
+                <w14:ligatures w14:val="none"/>
+              </w:rPr>
+              <w:t>Neural Network</w:t>
+            </w:r>
+          </w:p>
+        </w:tc>
+        <w:tc>
+          <w:tcPr>
+            <w:tcW w:w="960" w:type="dxa"/>
+            <w:tcBorders>
+              <w:top w:val="nil"/>
+              <w:left w:val="nil"/>
+              <w:bottom w:val="nil"/>
+              <w:right w:val="nil"/>
+            </w:tcBorders>
+            <w:noWrap/>
+            <w:vAlign w:val="bottom"/>
+            <w:hideMark/>
+          </w:tcPr>
+          <w:p>
+            <w:pPr>
+              <w:spacing w:after="0" w:line="240" w:lineRule="auto"/>
+              <w:jc w:val="right"/>
+              <w:rPr>
+                <w:rFonts w:ascii="Aptos Narrow" w:eastAsia="Times New Roman" w:hAnsi="Aptos Narrow" w:cs="Times New Roman"/>
+                <w:color w:val="000000"/>
+                <w:kern w:val="0"/>
+                <w:sz w:val="22"/>
+                <w:szCs w:val="22"/>
+                <w14:ligatures w14:val="none"/>
+              </w:rPr>
+            </w:pPr>
+            <w:r>
+              <w:rPr>
+                <w:rFonts w:ascii="Aptos Narrow" w:eastAsia="Times New Roman" w:hAnsi="Aptos Narrow" w:cs="Times New Roman"/>
+                <w:color w:val="000000"/>
+                <w:kern w:val="0"/>
+                <w:sz w:val="22"/>
+                <w:szCs w:val="22"/>
+                <w14:ligatures w14:val="none"/>
+              </w:rPr>
+              <w:t>0.6885</w:t>
+            </w:r>
+          </w:p>
+        </w:tc>
+        <w:tc>
+          <w:tcPr>
+            <w:tcW w:w="960" w:type="dxa"/>
+            <w:tcBorders>
+              <w:top w:val="nil"/>
+              <w:left w:val="nil"/>
+              <w:bottom w:val="nil"/>
+              <w:right w:val="nil"/>
+            </w:tcBorders>
+            <w:noWrap/>
+            <w:vAlign w:val="bottom"/>
+            <w:hideMark/>
+          </w:tcPr>
+          <w:p>
+            <w:pPr>
+              <w:spacing w:after="0" w:line="240" w:lineRule="auto"/>
+              <w:jc w:val="right"/>
+              <w:rPr>
+                <w:rFonts w:ascii="Aptos Narrow" w:eastAsia="Times New Roman" w:hAnsi="Aptos Narrow" w:cs="Times New Roman"/>
+                <w:color w:val="000000"/>
+                <w:kern w:val="0"/>
+                <w:sz w:val="22"/>
+                <w:szCs w:val="22"/>
+                <w14:ligatures w14:val="none"/>
+              </w:rPr>
+            </w:pPr>
+            <w:r>
+              <w:rPr>
+                <w:rFonts w:ascii="Aptos Narrow" w:eastAsia="Times New Roman" w:hAnsi="Aptos Narrow" w:cs="Times New Roman"/>
+                <w:color w:val="000000"/>
+                <w:kern w:val="0"/>
+                <w:sz w:val="22"/>
+                <w:szCs w:val="22"/>
+                <w14:ligatures w14:val="none"/>
+              </w:rPr>
+              <w:t>0.3039</w:t>
+            </w:r>
+          </w:p>
+        </w:tc>
+        <w:tc>
+          <w:tcPr>
+            <w:tcW w:w="960" w:type="dxa"/>
+            <w:tcBorders>
+              <w:top w:val="nil"/>
+              <w:left w:val="nil"/>
+              <w:bottom w:val="nil"/>
+              <w:right w:val="nil"/>
+            </w:tcBorders>
+            <w:noWrap/>
+            <w:vAlign w:val="bottom"/>
+            <w:hideMark/>
+          </w:tcPr>
+          <w:p>
+            <w:pPr>
+              <w:spacing w:after="0" w:line="240" w:lineRule="auto"/>
+              <w:jc w:val="right"/>
+              <w:rPr>
+                <w:rFonts w:ascii="Aptos Narrow" w:eastAsia="Times New Roman" w:hAnsi="Aptos Narrow" w:cs="Times New Roman"/>
+                <w:color w:val="000000"/>
+                <w:kern w:val="0"/>
+                <w:sz w:val="22"/>
+                <w:szCs w:val="22"/>
+                <w14:ligatures w14:val="none"/>
+              </w:rPr>
+            </w:pPr>
+            <w:r>
+              <w:rPr>
+                <w:rFonts w:ascii="Aptos Narrow" w:eastAsia="Times New Roman" w:hAnsi="Aptos Narrow" w:cs="Times New Roman"/>
+                <w:color w:val="000000"/>
+                <w:kern w:val="0"/>
+                <w:sz w:val="22"/>
+                <w:szCs w:val="22"/>
+                <w14:ligatures w14:val="none"/>
+              </w:rPr>
+              <w:t>0.5297</w:t>
+            </w:r>
+          </w:p>
+        </w:tc>
+        <w:tc>
+          <w:tcPr>
+            <w:tcW w:w="960" w:type="dxa"/>
+            <w:tcBorders>
+              <w:top w:val="nil"/>
+              <w:left w:val="nil"/>
+              <w:bottom w:val="nil"/>
+              <w:right w:val="nil"/>
+            </w:tcBorders>
+            <w:noWrap/>
+            <w:vAlign w:val="bottom"/>
+            <w:hideMark/>
+          </w:tcPr>
+          <w:p>
+            <w:pPr>
+              <w:spacing w:after="0" w:line="240" w:lineRule="auto"/>
+              <w:jc w:val="right"/>
+              <w:rPr>
+                <w:rFonts w:ascii="Aptos Narrow" w:eastAsia="Times New Roman" w:hAnsi="Aptos Narrow" w:cs="Times New Roman"/>
+                <w:color w:val="000000"/>
+                <w:kern w:val="0"/>
+                <w:sz w:val="22"/>
+                <w:szCs w:val="22"/>
+                <w14:ligatures w14:val="none"/>
+              </w:rPr>
+            </w:pPr>
+            <w:r>
+              <w:rPr>
+                <w:rFonts w:ascii="Aptos Narrow" w:eastAsia="Times New Roman" w:hAnsi="Aptos Narrow" w:cs="Times New Roman"/>
+                <w:color w:val="000000"/>
+                <w:kern w:val="0"/>
+                <w:sz w:val="22"/>
+                <w:szCs w:val="22"/>
+                <w14:ligatures w14:val="none"/>
+              </w:rPr>
+              <w:t>0.3862</w:t>
+            </w:r>
+          </w:p>
+        </w:tc>
+        <w:tc>
+          <w:tcPr>
+            <w:tcW w:w="960" w:type="dxa"/>
+            <w:tcBorders>
+              <w:top w:val="nil"/>
+              <w:left w:val="nil"/>
+              <w:bottom w:val="nil"/>
+              <w:right w:val="nil"/>
+            </w:tcBorders>
+            <w:noWrap/>
+            <w:vAlign w:val="bottom"/>
+            <w:hideMark/>
+          </w:tcPr>
+          <w:p>
+            <w:pPr>
+              <w:spacing w:after="0" w:line="240" w:lineRule="auto"/>
+              <w:jc w:val="right"/>
+              <w:rPr>
+                <w:rFonts w:ascii="Aptos Narrow" w:eastAsia="Times New Roman" w:hAnsi="Aptos Narrow" w:cs="Times New Roman"/>
+                <w:color w:val="000000"/>
+                <w:kern w:val="0"/>
+                <w:sz w:val="22"/>
+                <w:szCs w:val="22"/>
+                <w14:ligatures w14:val="none"/>
+              </w:rPr>
+            </w:pPr>
+            <w:r>
+              <w:rPr>
+                <w:rFonts w:ascii="Aptos Narrow" w:eastAsia="Times New Roman" w:hAnsi="Aptos Narrow" w:cs="Times New Roman"/>
+                <w:color w:val="000000"/>
+                <w:kern w:val="0"/>
+                <w:sz w:val="22"/>
+                <w:szCs w:val="22"/>
+                <w14:ligatures w14:val="none"/>
+              </w:rPr>
+              <w:t>0.6885</w:t>
+            </w:r>
+          </w:p>
+        </w:tc>
+      </w:tr>
+      <w:tr>
+        <w:trPr>
+          <w:trHeight w:val="290"/>
+        </w:trPr>
+        <w:tc>
+          <w:tcPr>
+            <w:tcW w:w="1718" w:type="dxa"/>
+            <w:tcBorders>
+              <w:top w:val="nil"/>
+              <w:left w:val="nil"/>
+              <w:bottom w:val="nil"/>
+              <w:right w:val="nil"/>
+            </w:tcBorders>
+            <w:noWrap/>
+            <w:vAlign w:val="bottom"/>
+            <w:hideMark/>
+          </w:tcPr>
+          <w:p>
+            <w:pPr>
+              <w:spacing w:after="0" w:line="240" w:lineRule="auto"/>
+              <w:rPr>
+                <w:rFonts w:ascii="Aptos Narrow" w:eastAsia="Times New Roman" w:hAnsi="Aptos Narrow" w:cs="Times New Roman"/>
+                <w:color w:val="000000"/>
+                <w:kern w:val="0"/>
+                <w:sz w:val="22"/>
+                <w:szCs w:val="22"/>
+                <w14:ligatures w14:val="none"/>
+              </w:rPr>
+            </w:pPr>
+            <w:r>
+              <w:rPr>
+                <w:rFonts w:ascii="Aptos Narrow" w:eastAsia="Times New Roman" w:hAnsi="Aptos Narrow" w:cs="Times New Roman"/>
+                <w:color w:val="000000"/>
+                <w:kern w:val="0"/>
+                <w:sz w:val="22"/>
+                <w:szCs w:val="22"/>
+                <w14:ligatures w14:val="none"/>
+              </w:rPr>
+              <w:t>Gradient Boosting</w:t>
+            </w:r>
+          </w:p>
+        </w:tc>
+        <w:tc>
+          <w:tcPr>
+            <w:tcW w:w="960" w:type="dxa"/>
+            <w:tcBorders>
+              <w:top w:val="nil"/>
+              <w:left w:val="nil"/>
+              <w:bottom w:val="nil"/>
+              <w:right w:val="nil"/>
+            </w:tcBorders>
+            <w:noWrap/>
+            <w:vAlign w:val="bottom"/>
+            <w:hideMark/>
+          </w:tcPr>
+          <w:p>
+            <w:pPr>
+              <w:spacing w:after="0" w:line="240" w:lineRule="auto"/>
+              <w:jc w:val="right"/>
+              <w:rPr>
+                <w:rFonts w:ascii="Aptos Narrow" w:eastAsia="Times New Roman" w:hAnsi="Aptos Narrow" w:cs="Times New Roman"/>
+                <w:color w:val="000000"/>
+                <w:kern w:val="0"/>
+                <w:sz w:val="22"/>
+                <w:szCs w:val="22"/>
+                <w14:ligatures w14:val="none"/>
+              </w:rPr>
+            </w:pPr>
+            <w:r>
+              <w:rPr>
+                <w:rFonts w:ascii="Aptos Narrow" w:eastAsia="Times New Roman" w:hAnsi="Aptos Narrow" w:cs="Times New Roman"/>
+                <w:color w:val="000000"/>
+                <w:kern w:val="0"/>
+                <w:sz w:val="22"/>
+                <w:szCs w:val="22"/>
+                <w14:ligatures w14:val="none"/>
+              </w:rPr>
+              <w:t>0.7125</w:t>
+            </w:r>
+          </w:p>
+        </w:tc>
+        <w:tc>
+          <w:tcPr>
+            <w:tcW w:w="960" w:type="dxa"/>
+            <w:tcBorders>
+              <w:top w:val="nil"/>
+              <w:left w:val="nil"/>
+              <w:bottom w:val="nil"/>
+              <w:right w:val="nil"/>
+            </w:tcBorders>
+            <w:noWrap/>
+            <w:vAlign w:val="bottom"/>
+            <w:hideMark/>
+          </w:tcPr>
+          <w:p>
+            <w:pPr>
+              <w:spacing w:after="0" w:line="240" w:lineRule="auto"/>
+              <w:jc w:val="right"/>
+              <w:rPr>
+                <w:rFonts w:ascii="Aptos Narrow" w:eastAsia="Times New Roman" w:hAnsi="Aptos Narrow" w:cs="Times New Roman"/>
+                <w:color w:val="000000"/>
+                <w:kern w:val="0"/>
+                <w:sz w:val="22"/>
+                <w:szCs w:val="22"/>
+                <w14:ligatures w14:val="none"/>
+              </w:rPr>
+            </w:pPr>
+            <w:r>
+              <w:rPr>
+                <w:rFonts w:ascii="Aptos Narrow" w:eastAsia="Times New Roman" w:hAnsi="Aptos Narrow" w:cs="Times New Roman"/>
+                <w:color w:val="000000"/>
+                <w:kern w:val="0"/>
+                <w:sz w:val="22"/>
+                <w:szCs w:val="22"/>
+                <w14:ligatures w14:val="none"/>
+              </w:rPr>
+              <w:t>0.3554</w:t>
+            </w:r>
+          </w:p>
+        </w:tc>
+        <w:tc>
+          <w:tcPr>
+            <w:tcW w:w="960" w:type="dxa"/>
+            <w:tcBorders>
+              <w:top w:val="nil"/>
+              <w:left w:val="nil"/>
+              <w:bottom w:val="nil"/>
+              <w:right w:val="nil"/>
+            </w:tcBorders>
+            <w:noWrap/>
+            <w:vAlign w:val="bottom"/>
+            <w:hideMark/>
+          </w:tcPr>
+          <w:p>
+            <w:pPr>
+              <w:spacing w:after="0" w:line="240" w:lineRule="auto"/>
+              <w:jc w:val="right"/>
+              <w:rPr>
+                <w:rFonts w:ascii="Aptos Narrow" w:eastAsia="Times New Roman" w:hAnsi="Aptos Narrow" w:cs="Times New Roman"/>
+                <w:color w:val="000000"/>
+                <w:kern w:val="0"/>
+                <w:sz w:val="22"/>
+                <w:szCs w:val="22"/>
+                <w14:ligatures w14:val="none"/>
+              </w:rPr>
+            </w:pPr>
+            <w:r>
+              <w:rPr>
+                <w:rFonts w:ascii="Aptos Narrow" w:eastAsia="Times New Roman" w:hAnsi="Aptos Narrow" w:cs="Times New Roman"/>
+                <w:color w:val="000000"/>
+                <w:kern w:val="0"/>
+                <w:sz w:val="22"/>
+                <w:szCs w:val="22"/>
+                <w14:ligatures w14:val="none"/>
+              </w:rPr>
+              <w:t>0.6811</w:t>
+            </w:r>
+          </w:p>
+        </w:tc>
+        <w:tc>
+          <w:tcPr>
+            <w:tcW w:w="960" w:type="dxa"/>
+            <w:tcBorders>
+              <w:top w:val="nil"/>
+              <w:left w:val="nil"/>
+              <w:bottom w:val="nil"/>
+              <w:right w:val="nil"/>
+            </w:tcBorders>
+            <w:noWrap/>
+            <w:vAlign w:val="bottom"/>
+            <w:hideMark/>
+          </w:tcPr>
+          <w:p>
+            <w:pPr>
+              <w:spacing w:after="0" w:line="240" w:lineRule="auto"/>
+              <w:jc w:val="right"/>
+              <w:rPr>
+                <w:rFonts w:ascii="Aptos Narrow" w:eastAsia="Times New Roman" w:hAnsi="Aptos Narrow" w:cs="Times New Roman"/>
+                <w:color w:val="000000"/>
+                <w:kern w:val="0"/>
+                <w:sz w:val="22"/>
+                <w:szCs w:val="22"/>
+                <w14:ligatures w14:val="none"/>
+              </w:rPr>
+            </w:pPr>
+            <w:r>
+              <w:rPr>
+                <w:rFonts w:ascii="Aptos Narrow" w:eastAsia="Times New Roman" w:hAnsi="Aptos Narrow" w:cs="Times New Roman"/>
+                <w:color w:val="000000"/>
+                <w:kern w:val="0"/>
+                <w:sz w:val="22"/>
+                <w:szCs w:val="22"/>
+                <w14:ligatures w14:val="none"/>
+              </w:rPr>
+              <w:t>0.4671</w:t>
+            </w:r>
+          </w:p>
+        </w:tc>
+        <w:tc>
+          <w:tcPr>
+            <w:tcW w:w="960" w:type="dxa"/>
+            <w:tcBorders>
+              <w:top w:val="nil"/>
+              <w:left w:val="nil"/>
+              <w:bottom w:val="nil"/>
+              <w:right w:val="nil"/>
+            </w:tcBorders>
+            <w:noWrap/>
+            <w:vAlign w:val="bottom"/>
+            <w:hideMark/>
+          </w:tcPr>
+          <w:p>
+            <w:pPr>
+              <w:spacing w:after="0" w:line="240" w:lineRule="auto"/>
+              <w:jc w:val="right"/>
+              <w:rPr>
+                <w:rFonts w:ascii="Aptos Narrow" w:eastAsia="Times New Roman" w:hAnsi="Aptos Narrow" w:cs="Times New Roman"/>
+                <w:color w:val="000000"/>
+                <w:kern w:val="0"/>
+                <w:sz w:val="22"/>
+                <w:szCs w:val="22"/>
+                <w14:ligatures w14:val="none"/>
+              </w:rPr>
+            </w:pPr>
+            <w:r>
+              <w:rPr>
+                <w:rFonts w:ascii="Aptos Narrow" w:eastAsia="Times New Roman" w:hAnsi="Aptos Narrow" w:cs="Times New Roman"/>
+                <w:color w:val="000000"/>
+                <w:kern w:val="0"/>
+                <w:sz w:val="22"/>
+                <w:szCs w:val="22"/>
+                <w14:ligatures w14:val="none"/>
+              </w:rPr>
+              <w:t>0.7636</w:t>
+            </w:r>
+          </w:p>
+        </w:tc>
+      </w:tr>
+    </w:tbl>
+    <w:p/>
     <w:sectPr>
       <w:pgSz w:w="12240" w:h="15840"/>
       <w:pgMar w:top="1440" w:right="1440" w:bottom="1440" w:left="1440" w:header="720" w:footer="720" w:gutter="0"/>
@@ -753,6 +1975,7 @@
   <w:style w:type="character" w:default="1" w:styleId="DefaultParagraphFont">
     <w:name w:val="Default Paragraph Font"/>
     <w:uiPriority w:val="1"/>
+    <w:semiHidden/>
     <w:unhideWhenUsed/>
   </w:style>
   <w:style w:type="table" w:default="1" w:styleId="TableNormal">

</xml_diff>